<commit_message>
Add the live demo and repository links to the report, deck and README
Co-Authored-By: Claude Opus 5.5 <noreply@anthropic.com>
</commit_message>
<xml_diff>
--- a/docs/review2/BranchLab_Review2_Progress_Report.docx
+++ b/docs/review2/BranchLab_Review2_Progress_Report.docx
@@ -224,8 +224,43 @@
           <w:b w:val="0"/>
           <w:i w:val="0"/>
         </w:rPr>
-        <w:t>Repository: [GitHub link]</w:t>
+        <w:t xml:space="preserve">Repository: </w:t>
       </w:r>
+      <w:hyperlink r:id="rIdBLRepo" w:history="1">
+        <w:r>
+          <w:rPr>
+            <w:b w:val="0"/>
+            <w:i w:val="0"/>
+            <w:color w:val="0563C1"/>
+            <w:u w:val="single"/>
+          </w:rPr>
+          <w:t>https://github.com/SnehaGEE/ast-test-generator</w:t>
+        </w:r>
+      </w:hyperlink>
+    </w:p>
+    <w:p>
+      <w:pPr>
+        <w:spacing w:after="80"/>
+        <w:jc w:val="center"/>
+      </w:pPr>
+      <w:r>
+        <w:rPr>
+          <w:b w:val="0"/>
+          <w:i w:val="0"/>
+        </w:rPr>
+        <w:t xml:space="preserve">Live demo: </w:t>
+      </w:r>
+      <w:hyperlink r:id="rIdBLDemo" w:history="1">
+        <w:r>
+          <w:rPr>
+            <w:b w:val="0"/>
+            <w:i w:val="0"/>
+            <w:color w:val="0563C1"/>
+            <w:u w:val="single"/>
+          </w:rPr>
+          <w:t>https://branchlab-ggon.onrender.com</w:t>
+        </w:r>
+      </w:hyperlink>
     </w:p>
     <w:p>
       <w:r>

</xml_diff>